<commit_message>
- Fixed wrong image rotation.
</commit_message>
<xml_diff>
--- a/documentazione/documentazione.docx
+++ b/documentazione/documentazione.docx
@@ -30,6 +30,7 @@
           <w:bCs/>
           <w:sz w:val="48"/>
           <w:szCs w:val="48"/>
+          <w:highlight w:val="none"/>
         </w:rPr>
       </w:r>
       <w:r>
@@ -108,6 +109,7 @@
           <w:bCs w:val="0"/>
           <w:sz w:val="24"/>
           <w:szCs w:val="24"/>
+          <w:highlight w:val="none"/>
         </w:rPr>
       </w:r>
       <w:r>
@@ -208,7 +210,7 @@
             </w:pict>
           </mc:Fallback>
         </mc:AlternateContent>
-        <w:t xml:space="preserve">    </w:t>
+        <w:t xml:space="preserve">   </w:t>
         <mc:AlternateContent>
           <mc:Choice Requires="wpg">
             <w:drawing>
@@ -223,7 +225,7 @@
                   <a:graphicData uri="http://schemas.openxmlformats.org/drawingml/2006/picture">
                     <pic:pic xmlns:pic="http://schemas.openxmlformats.org/drawingml/2006/picture">
                       <pic:nvPicPr>
-                        <pic:cNvPr id="1534961631" name=""/>
+                        <pic:cNvPr id="174627348" name=""/>
                         <pic:cNvPicPr>
                           <a:picLocks noChangeAspect="1"/>
                         </pic:cNvPicPr>
@@ -234,9 +236,9 @@
                         <a:stretch/>
                       </pic:blipFill>
                       <pic:spPr bwMode="auto">
-                        <a:xfrm flipH="1" flipV="0">
+                        <a:xfrm flipH="0" flipV="0">
                           <a:off x="0" y="0"/>
-                          <a:ext cx="1753318" cy="3896264"/>
+                          <a:ext cx="1753319" cy="3896264"/>
                         </a:xfrm>
                         <a:prstGeom prst="rect">
                           <a:avLst/>
@@ -269,14 +271,14 @@
                 <v:path o:extrusionok="f" gradientshapeok="t" o:connecttype="rect"/>
                 <o:lock v:ext="edit" aspectratio="t"/>
               </v:shapetype>
-              <v:shape id="_x0000_i1" o:spid="_x0000_s1" type="#_x0000_t75" style="width:138.06pt;height:306.79pt;mso-wrap-distance-left:0.00pt;mso-wrap-distance-top:0.00pt;mso-wrap-distance-right:0.00pt;mso-wrap-distance-bottom:0.00pt;flip:x;z-index:1;" stroked="false">
+              <v:shape id="_x0000_i1" o:spid="_x0000_s1" type="#_x0000_t75" style="width:138.06pt;height:306.79pt;mso-wrap-distance-left:0.00pt;mso-wrap-distance-top:0.00pt;mso-wrap-distance-right:0.00pt;mso-wrap-distance-bottom:0.00pt;z-index:1;" stroked="false">
                 <v:imagedata r:id="rId11" o:title=""/>
                 <o:lock v:ext="edit" rotation="t"/>
               </v:shape>
             </w:pict>
           </mc:Fallback>
         </mc:AlternateContent>
-        <w:t xml:space="preserve">   </w:t>
+        <w:t xml:space="preserve">    </w:t>
       </w:r>
       <w:r>
         <w:rPr>
@@ -516,7 +518,6 @@
           <w:bCs w:val="0"/>
           <w:sz w:val="24"/>
           <w:szCs w:val="24"/>
-          <w:highlight w:val="none"/>
         </w:rPr>
       </w:r>
       <w:r>
@@ -556,6 +557,7 @@
           <w:bCs w:val="0"/>
           <w:sz w:val="24"/>
           <w:szCs w:val="24"/>
+          <w:highlight w:val="none"/>
         </w:rPr>
       </w:r>
       <w:r>
@@ -1820,6 +1822,7 @@
           <w:sz w:val="24"/>
           <w:szCs w:val="24"/>
           <w:highlight w:val="none"/>
+          <w:lang w:val="it-IT"/>
         </w:rPr>
       </w:r>
       <w:r>
@@ -2075,7 +2078,6 @@
           <w:sz w:val="28"/>
           <w:szCs w:val="28"/>
           <w:highlight w:val="none"/>
-          <w:lang w:val="it-IT"/>
         </w:rPr>
       </w:r>
       <w:r>
@@ -2447,49 +2449,10 @@
           <w:b w:val="0"/>
           <w:bCs w:val="0"/>
           <w:i w:val="0"/>
-          <w:iCs w:val="0"/>
           <w:sz w:val="24"/>
           <w:szCs w:val="24"/>
           <w:highlight w:val="none"/>
           <w:lang w:val="it-IT"/>
-        </w:rPr>
-      </w:r>
-      <w:r>
-        <w:rPr>
-          <w:b w:val="0"/>
-          <w:bCs w:val="0"/>
-          <w:i w:val="0"/>
-          <w:sz w:val="24"/>
-          <w:szCs w:val="24"/>
-          <w:highlight w:val="none"/>
-          <w:lang w:val="it-IT"/>
-        </w:rPr>
-      </w:r>
-      <w:r>
-        <w:rPr>
-          <w:b/>
-          <w:bCs/>
-          <w:sz w:val="40"/>
-          <w:szCs w:val="40"/>
-          <w:highlight w:val="none"/>
-        </w:rPr>
-      </w:r>
-      <w:r>
-        <w:rPr>
-          <w:b/>
-          <w:bCs/>
-          <w:sz w:val="40"/>
-          <w:szCs w:val="40"/>
-          <w:highlight w:val="none"/>
-        </w:rPr>
-      </w:r>
-      <w:r>
-        <w:rPr>
-          <w:b/>
-          <w:bCs/>
-          <w:sz w:val="40"/>
-          <w:szCs w:val="40"/>
-          <w:highlight w:val="none"/>
         </w:rPr>
       </w:r>
       <w:r>
@@ -2537,6 +2500,17 @@
           <w:bCs w:val="0"/>
           <w:i w:val="0"/>
           <w:iCs w:val="0"/>
+          <w:sz w:val="24"/>
+          <w:szCs w:val="24"/>
+          <w:highlight w:val="none"/>
+          <w:lang w:val="it-IT"/>
+        </w:rPr>
+      </w:r>
+      <w:r>
+        <w:rPr>
+          <w:b w:val="0"/>
+          <w:bCs w:val="0"/>
+          <w:i w:val="0"/>
           <w:sz w:val="24"/>
           <w:szCs w:val="24"/>
           <w:highlight w:val="none"/>
@@ -2949,6 +2923,8 @@
           <w:bCs w:val="0"/>
           <w:sz w:val="24"/>
           <w:szCs w:val="24"/>
+          <w:highlight w:val="none"/>
+          <w:lang w:val="it-IT"/>
         </w:rPr>
       </w:r>
       <w:r>
@@ -2996,8 +2972,6 @@
           <w:bCs w:val="0"/>
           <w:sz w:val="24"/>
           <w:szCs w:val="24"/>
-          <w:highlight w:val="none"/>
-          <w:lang w:val="it-IT"/>
         </w:rPr>
       </w:r>
       <w:r>
@@ -3044,7 +3018,6 @@
           <w:bCs w:val="0"/>
           <w:sz w:val="24"/>
           <w:szCs w:val="24"/>
-          <w:highlight w:val="none"/>
           <w:lang w:val="it-IT"/>
         </w:rPr>
       </w:r>
@@ -3093,7 +3066,6 @@
           <w:bCs w:val="0"/>
           <w:sz w:val="24"/>
           <w:szCs w:val="24"/>
-          <w:highlight w:val="none"/>
           <w:lang w:val="it-IT"/>
         </w:rPr>
       </w:r>
@@ -3142,7 +3114,6 @@
           <w:bCs w:val="0"/>
           <w:sz w:val="24"/>
           <w:szCs w:val="24"/>
-          <w:highlight w:val="none"/>
           <w:lang w:val="it-IT"/>
         </w:rPr>
       </w:r>
@@ -3257,7 +3228,6 @@
           <w:bCs/>
           <w:sz w:val="40"/>
           <w:szCs w:val="40"/>
-          <w:highlight w:val="none"/>
         </w:rPr>
       </w:r>
       <w:r>
@@ -3381,7 +3351,7 @@
         <w:rFonts w:hint="default" w:ascii="Symbol" w:hAnsi="Symbol" w:eastAsia="Symbol" w:cs="Symbol"/>
       </w:rPr>
       <w:start w:val="1"/>
-      <w:suff w:val="tab"/>
+      <w:suff w:val="space"/>
     </w:lvl>
     <w:lvl w:ilvl="1">
       <w:isLgl w:val="false"/>
@@ -3397,7 +3367,7 @@
         <w:rFonts w:hint="default" w:ascii="Courier New" w:hAnsi="Courier New" w:eastAsia="Courier New" w:cs="Courier New"/>
       </w:rPr>
       <w:start w:val="1"/>
-      <w:suff w:val="tab"/>
+      <w:suff w:val="space"/>
     </w:lvl>
     <w:lvl w:ilvl="2">
       <w:isLgl w:val="false"/>
@@ -3413,7 +3383,7 @@
         <w:rFonts w:hint="default" w:ascii="Wingdings" w:hAnsi="Wingdings" w:eastAsia="Wingdings" w:cs="Wingdings"/>
       </w:rPr>
       <w:start w:val="1"/>
-      <w:suff w:val="tab"/>
+      <w:suff w:val="space"/>
     </w:lvl>
     <w:lvl w:ilvl="3">
       <w:isLgl w:val="false"/>
@@ -3429,7 +3399,7 @@
         <w:rFonts w:hint="default" w:ascii="Symbol" w:hAnsi="Symbol" w:eastAsia="Symbol" w:cs="Symbol"/>
       </w:rPr>
       <w:start w:val="1"/>
-      <w:suff w:val="tab"/>
+      <w:suff w:val="space"/>
     </w:lvl>
     <w:lvl w:ilvl="4">
       <w:isLgl w:val="false"/>
@@ -3445,7 +3415,7 @@
         <w:rFonts w:hint="default" w:ascii="Courier New" w:hAnsi="Courier New" w:eastAsia="Courier New" w:cs="Courier New"/>
       </w:rPr>
       <w:start w:val="1"/>
-      <w:suff w:val="tab"/>
+      <w:suff w:val="space"/>
     </w:lvl>
     <w:lvl w:ilvl="5">
       <w:isLgl w:val="false"/>
@@ -3461,7 +3431,7 @@
         <w:rFonts w:hint="default" w:ascii="Wingdings" w:hAnsi="Wingdings" w:eastAsia="Wingdings" w:cs="Wingdings"/>
       </w:rPr>
       <w:start w:val="1"/>
-      <w:suff w:val="tab"/>
+      <w:suff w:val="space"/>
     </w:lvl>
     <w:lvl w:ilvl="6">
       <w:isLgl w:val="false"/>
@@ -3477,7 +3447,7 @@
         <w:rFonts w:hint="default" w:ascii="Symbol" w:hAnsi="Symbol" w:eastAsia="Symbol" w:cs="Symbol"/>
       </w:rPr>
       <w:start w:val="1"/>
-      <w:suff w:val="tab"/>
+      <w:suff w:val="space"/>
     </w:lvl>
     <w:lvl w:ilvl="7">
       <w:isLgl w:val="false"/>
@@ -3493,7 +3463,7 @@
         <w:rFonts w:hint="default" w:ascii="Courier New" w:hAnsi="Courier New" w:eastAsia="Courier New" w:cs="Courier New"/>
       </w:rPr>
       <w:start w:val="1"/>
-      <w:suff w:val="tab"/>
+      <w:suff w:val="space"/>
     </w:lvl>
     <w:lvl w:ilvl="8">
       <w:isLgl w:val="false"/>
@@ -3509,7 +3479,7 @@
         <w:rFonts w:hint="default" w:ascii="Wingdings" w:hAnsi="Wingdings" w:eastAsia="Wingdings" w:cs="Wingdings"/>
       </w:rPr>
       <w:start w:val="1"/>
-      <w:suff w:val="tab"/>
+      <w:suff w:val="space"/>
     </w:lvl>
   </w:abstractNum>
   <w:abstractNum w:abstractNumId="1">
@@ -3527,7 +3497,7 @@
         <w:rFonts w:hint="default" w:ascii="Symbol" w:hAnsi="Symbol" w:eastAsia="Symbol" w:cs="Symbol"/>
       </w:rPr>
       <w:start w:val="1"/>
-      <w:suff w:val="tab"/>
+      <w:suff w:val="space"/>
     </w:lvl>
     <w:lvl w:ilvl="1">
       <w:isLgl w:val="false"/>
@@ -3543,7 +3513,7 @@
         <w:rFonts w:hint="default" w:ascii="Courier New" w:hAnsi="Courier New" w:eastAsia="Courier New" w:cs="Courier New"/>
       </w:rPr>
       <w:start w:val="1"/>
-      <w:suff w:val="tab"/>
+      <w:suff w:val="space"/>
     </w:lvl>
     <w:lvl w:ilvl="2">
       <w:isLgl w:val="false"/>
@@ -3559,7 +3529,7 @@
         <w:rFonts w:hint="default" w:ascii="Wingdings" w:hAnsi="Wingdings" w:eastAsia="Wingdings" w:cs="Wingdings"/>
       </w:rPr>
       <w:start w:val="1"/>
-      <w:suff w:val="tab"/>
+      <w:suff w:val="space"/>
     </w:lvl>
     <w:lvl w:ilvl="3">
       <w:isLgl w:val="false"/>
@@ -3575,7 +3545,7 @@
         <w:rFonts w:hint="default" w:ascii="Symbol" w:hAnsi="Symbol" w:eastAsia="Symbol" w:cs="Symbol"/>
       </w:rPr>
       <w:start w:val="1"/>
-      <w:suff w:val="tab"/>
+      <w:suff w:val="space"/>
     </w:lvl>
     <w:lvl w:ilvl="4">
       <w:isLgl w:val="false"/>
@@ -3591,7 +3561,7 @@
         <w:rFonts w:hint="default" w:ascii="Courier New" w:hAnsi="Courier New" w:eastAsia="Courier New" w:cs="Courier New"/>
       </w:rPr>
       <w:start w:val="1"/>
-      <w:suff w:val="tab"/>
+      <w:suff w:val="space"/>
     </w:lvl>
     <w:lvl w:ilvl="5">
       <w:isLgl w:val="false"/>
@@ -3607,7 +3577,7 @@
         <w:rFonts w:hint="default" w:ascii="Wingdings" w:hAnsi="Wingdings" w:eastAsia="Wingdings" w:cs="Wingdings"/>
       </w:rPr>
       <w:start w:val="1"/>
-      <w:suff w:val="tab"/>
+      <w:suff w:val="space"/>
     </w:lvl>
     <w:lvl w:ilvl="6">
       <w:isLgl w:val="false"/>
@@ -3623,7 +3593,7 @@
         <w:rFonts w:hint="default" w:ascii="Symbol" w:hAnsi="Symbol" w:eastAsia="Symbol" w:cs="Symbol"/>
       </w:rPr>
       <w:start w:val="1"/>
-      <w:suff w:val="tab"/>
+      <w:suff w:val="space"/>
     </w:lvl>
     <w:lvl w:ilvl="7">
       <w:isLgl w:val="false"/>
@@ -3639,7 +3609,7 @@
         <w:rFonts w:hint="default" w:ascii="Courier New" w:hAnsi="Courier New" w:eastAsia="Courier New" w:cs="Courier New"/>
       </w:rPr>
       <w:start w:val="1"/>
-      <w:suff w:val="tab"/>
+      <w:suff w:val="space"/>
     </w:lvl>
     <w:lvl w:ilvl="8">
       <w:isLgl w:val="false"/>
@@ -3655,7 +3625,7 @@
         <w:rFonts w:hint="default" w:ascii="Wingdings" w:hAnsi="Wingdings" w:eastAsia="Wingdings" w:cs="Wingdings"/>
       </w:rPr>
       <w:start w:val="1"/>
-      <w:suff w:val="tab"/>
+      <w:suff w:val="space"/>
     </w:lvl>
   </w:abstractNum>
   <w:num w:numId="1">

</xml_diff>